<commit_message>
Modifiacion Resumen y se agrego Filminas
</commit_message>
<xml_diff>
--- a/Bibliografia/Resumenes/RE_2_Abrate.docx
+++ b/Bibliografia/Resumenes/RE_2_Abrate.docx
@@ -17,7 +17,6 @@
         </w:r>
       </w:hyperlink>
     </w:p>
-    <w:p/>
     <w:p>
       <w:r>
         <w:t>TDD Practico:</w:t>
@@ -33,11 +32,103 @@
         </w:r>
       </w:hyperlink>
     </w:p>
-    <w:p/>
-    <w:p>
-      <w:r>
-        <w:t>Resumen:</w:t>
-      </w:r>
+    <w:p>
+      <w:proofErr w:type="spellStart"/>
+      <w:r>
+        <w:t>Testing</w:t>
+      </w:r>
+      <w:proofErr w:type="spellEnd"/>
+      <w:r>
+        <w:t xml:space="preserve"> Agile:</w:t>
+      </w:r>
+    </w:p>
+    <w:p>
+      <w:hyperlink r:id="rId6" w:history="1">
+        <w:r>
+          <w:rPr>
+            <w:rStyle w:val="Hipervnculo"/>
+          </w:rPr>
+          <w:t>https://www.notion.so/Testing-Agile-28c9b339e30580f58362c1a5f8465a7e?source=copy_link</w:t>
+        </w:r>
+      </w:hyperlink>
+    </w:p>
+    <w:p>
+      <w:proofErr w:type="spellStart"/>
+      <w:r>
+        <w:t>Testing</w:t>
+      </w:r>
+      <w:proofErr w:type="spellEnd"/>
+      <w:r>
+        <w:t xml:space="preserve"> Caja Negra:</w:t>
+      </w:r>
+    </w:p>
+    <w:p>
+      <w:hyperlink r:id="rId7" w:history="1">
+        <w:r>
+          <w:rPr>
+            <w:rStyle w:val="Hipervnculo"/>
+          </w:rPr>
+          <w:t>https://www.notion.so/Testing-de-Caja-Negra-28e9b339e305804c8f02c35be18fdb1b?source=copy_link</w:t>
+        </w:r>
+      </w:hyperlink>
+    </w:p>
+    <w:p>
+      <w:r>
+        <w:t xml:space="preserve">TP10 – </w:t>
+      </w:r>
+      <w:proofErr w:type="spellStart"/>
+      <w:r>
+        <w:t>Testing</w:t>
+      </w:r>
+      <w:proofErr w:type="spellEnd"/>
+      <w:r>
+        <w:t xml:space="preserve"> Caja Negra:</w:t>
+      </w:r>
+    </w:p>
+    <w:p>
+      <w:hyperlink r:id="rId8" w:history="1">
+        <w:r>
+          <w:rPr>
+            <w:rStyle w:val="Hipervnculo"/>
+          </w:rPr>
+          <w:t>https://www.notion.so/TP-10-Testing-de-Caja-Negra-2959b339e30580bd9814fca79b76e479?source=copy_link</w:t>
+        </w:r>
+      </w:hyperlink>
+    </w:p>
+    <w:p>
+      <w:r>
+        <w:t>Lean y KANBAN:</w:t>
+      </w:r>
+    </w:p>
+    <w:p>
+      <w:hyperlink r:id="rId9" w:history="1">
+        <w:r>
+          <w:rPr>
+            <w:rStyle w:val="Hipervnculo"/>
+          </w:rPr>
+          <w:t>https://www.notion.so/Lean-y-KANBAN-29a9b339e30580bb9777f240a1b9f3d1?source=copy_link</w:t>
+        </w:r>
+      </w:hyperlink>
+    </w:p>
+    <w:p>
+      <w:proofErr w:type="spellStart"/>
+      <w:r>
+        <w:t>Metricas</w:t>
+      </w:r>
+      <w:proofErr w:type="spellEnd"/>
+      <w:r>
+        <w:t>:</w:t>
+      </w:r>
+    </w:p>
+    <w:p>
+      <w:hyperlink r:id="rId10" w:history="1">
+        <w:r>
+          <w:rPr>
+            <w:rStyle w:val="Hipervnculo"/>
+          </w:rPr>
+          <w:t>https://www.notion.so/Metricas-2a19b339e305807a8bd2dba03f97a60a?source=copy_link</w:t>
+        </w:r>
+      </w:hyperlink>
     </w:p>
     <w:p>
       <w:pPr>
@@ -51,7 +142,7 @@
           <w:i/>
           <w:iCs/>
         </w:rPr>
-        <w:t xml:space="preserve">Próximamente </w:t>
+        <w:t xml:space="preserve"> </w:t>
       </w:r>
     </w:p>
     <w:sectPr>

</xml_diff>